<commit_message>
Add CCNA vs Real World entry: dynamic VLAN not carried to Instant VC
Co-Authored-By: Claude Opus 5.5 <noreply@anthropic.com>
Claude-Session: https://claude.ai/code/session_01DZwzvGP29kTgZHNh8Sqgpd
</commit_message>
<xml_diff>
--- a/real-world/CCNA_vs_RealWorld.docx
+++ b/real-world/CCNA_vs_RealWorld.docx
@@ -6395,7 +6395,7 @@
           <w:numId w:val="2"/>
         </w:numPr>
       </w:pPr>
-      <w:hyperlink w:history="1" r:id="rIdatc_k_lo2vtgjrt6iynoz">
+      <w:hyperlink w:history="1" r:id="rIdfpldnuncob0y1cyldpc_n">
         <w:r>
           <w:rPr>
             <w:rStyle w:val="Hyperlink"/>
@@ -6413,7 +6413,7 @@
           <w:numId w:val="2"/>
         </w:numPr>
       </w:pPr>
-      <w:hyperlink w:history="1" r:id="rIdjkvvfrpxtzfyqeihfvajy">
+      <w:hyperlink w:history="1" r:id="rIdp4fs5jz8ifgsyn2umc8mb">
         <w:r>
           <w:rPr>
             <w:rStyle w:val="Hyperlink"/>
@@ -6431,7 +6431,7 @@
           <w:numId w:val="2"/>
         </w:numPr>
       </w:pPr>
-      <w:hyperlink w:history="1" r:id="rIdqa4djt8ansz8oj_e901qi">
+      <w:hyperlink w:history="1" r:id="rIdyvryfy-8thce1r-yxt2-d">
         <w:r>
           <w:rPr>
             <w:rStyle w:val="Hyperlink"/>
@@ -6797,6 +6797,556 @@
           <w:rFonts w:ascii="Calibri" w:cs="Calibri" w:eastAsia="Calibri" w:hAnsi="Calibri"/>
         </w:rPr>
         <w:t xml:space="preserve">The caching redirect entry above explains the caching mechanism; this is the failure mode when the requesting subnet isn't one the cache knows how to serve. Fix is either: point the download's source-interface at an interface/subnet that already has CACHE-SRV access, or get VLAN X added to whatever routing/ACL/cache-mapping controls reachability to that regional CACHE-SRV node. Worth checking source-interface config on any ISR before assuming a failed firmware download is a bad file or a dead CACHE-SRV node — a source-address/reachability mismatch looks identical from the CLI.</w:t>
+      </w:r>
+    </w:p>
+    <w:p>
+      <w:pPr>
+        <w:pStyle w:val="Heading2"/>
+      </w:pPr>
+      <w:r>
+        <w:rPr>
+          <w:rFonts w:ascii="Calibri" w:cs="Calibri" w:eastAsia="Calibri" w:hAnsi="Calibri"/>
+        </w:rPr>
+        <w:t xml:space="preserve">Live Issue — Wireless Clients Get No IP After RADIUS Assigns a VLAN (Instant AP Cluster)</w:t>
+      </w:r>
+    </w:p>
+    <w:p>
+      <w:r>
+        <w:rPr>
+          <w:rFonts w:ascii="Calibri" w:cs="Calibri" w:eastAsia="Calibri" w:hAnsi="Calibri"/>
+          <w:b/>
+          <w:bCs/>
+        </w:rPr>
+        <w:t xml:space="preserve">📊 Level:</w:t>
+      </w:r>
+      <w:r>
+        <w:rPr>
+          <w:rFonts w:ascii="Calibri" w:cs="Calibri" w:eastAsia="Calibri" w:hAnsi="Calibri"/>
+        </w:rPr>
+        <w:t xml:space="preserve"> CCNA + Vendor — VLANs, trunks and allowed-VLAN lists are CCNA (2.1, 2.2); 802.1X/RADIUS is CCNA (5.x); dynamic VLAN assignment and Aruba Instant virtual controller forwarding are vendor-specific.</w:t>
+      </w:r>
+    </w:p>
+    <w:p>
+      <w:r>
+        <w:rPr>
+          <w:rFonts w:ascii="Calibri" w:cs="Calibri" w:eastAsia="Calibri" w:hAnsi="Calibri"/>
+          <w:b/>
+          <w:bCs/>
+          <w:i/>
+          <w:iCs/>
+        </w:rPr>
+        <w:t xml:space="preserve">🧠 What CCNA already gave me:</w:t>
+      </w:r>
+      <w:r>
+        <w:rPr>
+          <w:rFonts w:ascii="Calibri" w:cs="Calibri" w:eastAsia="Calibri" w:hAnsi="Calibri"/>
+        </w:rPr>
+        <w:t xml:space="preserve"> </w:t>
+      </w:r>
+      <w:r>
+        <w:rPr>
+          <w:rFonts w:ascii="Calibri" w:cs="Calibri" w:eastAsia="Calibri" w:hAnsi="Calibri"/>
+          <w:i/>
+          <w:iCs/>
+        </w:rPr>
+        <w:t xml:space="preserve">A switch only forwards a VLAN that exists in its VLAN database, and a trunk only carries VLANs on its allowed list — anything else is dropped silently. 802.1X uses RADIUS to authenticate users, and wireless architectures can centralise traffic through a controller.</w:t>
+      </w:r>
+    </w:p>
+    <w:p>
+      <w:r>
+        <w:rPr>
+          <w:rFonts w:ascii="Calibri" w:cs="Calibri" w:eastAsia="Calibri" w:hAnsi="Calibri"/>
+          <w:b/>
+          <w:bCs/>
+        </w:rPr>
+        <w:t xml:space="preserve">🔧 What's actually happening:</w:t>
+      </w:r>
+      <w:r>
+        <w:rPr>
+          <w:rFonts w:ascii="Calibri" w:cs="Calibri" w:eastAsia="Calibri" w:hAnsi="Calibri"/>
+        </w:rPr>
+        <w:t xml:space="preserve"> Wireless clients on an Aruba Instant AP cluster authenticate, RADIUS assigns them VLAN X, and then they get no IP address (169.254.x.x), no DNS and no internet. Clients on the virtual controller (VC) AP itself work; clients on member APs don't.</w:t>
+      </w:r>
+    </w:p>
+    <w:p>
+      <w:pPr>
+        <w:pStyle w:val="ListParagraph"/>
+        <w:numPr>
+          <w:ilvl w:val="0"/>
+          <w:numId w:val="2"/>
+        </w:numPr>
+      </w:pPr>
+      <w:r>
+        <w:rPr>
+          <w:rFonts w:ascii="Calibri" w:cs="Calibri" w:eastAsia="Calibri" w:hAnsi="Calibri"/>
+        </w:rPr>
+        <w:t xml:space="preserve">Step 1 — RADIUS picks the VLAN: on authentication (or a later Change of Authorisation, CoA), RADIUS tells the AP to put the client in VLAN X. The VLAN follows the user, not the switch port, so it can appear on any AP at any time.</w:t>
+      </w:r>
+    </w:p>
+    <w:p>
+      <w:pPr>
+        <w:pStyle w:val="ListParagraph"/>
+        <w:numPr>
+          <w:ilvl w:val="0"/>
+          <w:numId w:val="2"/>
+        </w:numPr>
+      </w:pPr>
+      <w:r>
+        <w:rPr>
+          <w:rFonts w:ascii="Calibri" w:cs="Calibri" w:eastAsia="Calibri" w:hAnsi="Calibri"/>
+        </w:rPr>
+        <w:t xml:space="preserve">Step 2 — the member AP tags the traffic: the AP serving the client puts its frames in VLAN X (802.1Q tag) and sends them out its wired uplink.</w:t>
+      </w:r>
+    </w:p>
+    <w:p>
+      <w:pPr>
+        <w:pStyle w:val="ListParagraph"/>
+        <w:numPr>
+          <w:ilvl w:val="0"/>
+          <w:numId w:val="2"/>
+        </w:numPr>
+      </w:pPr>
+      <w:r>
+        <w:rPr>
+          <w:rFonts w:ascii="Calibri" w:cs="Calibri" w:eastAsia="Calibri" w:hAnsi="Calibri"/>
+        </w:rPr>
+        <w:t xml:space="preserve">Step 3 — the traffic must reach the VC: in this design the VC AP holds the tunnel to the head-end, and DHCP, DNS and internet for VLAN X are only on the far side of that tunnel. So member AP traffic must cross the site's switches, at Layer 2, to the VC AP.</w:t>
+      </w:r>
+    </w:p>
+    <w:p>
+      <w:pPr>
+        <w:pStyle w:val="ListParagraph"/>
+        <w:numPr>
+          <w:ilvl w:val="0"/>
+          <w:numId w:val="2"/>
+        </w:numPr>
+      </w:pPr>
+      <w:r>
+        <w:rPr>
+          <w:rFonts w:ascii="Calibri" w:cs="Calibri" w:eastAsia="Calibri" w:hAnsi="Calibri"/>
+        </w:rPr>
+        <w:t xml:space="preserve">Step 4 — the edge switch drops it: VLAN X didn't exist on the access switches and wasn't allowed on the AP ports or uplinks. A switch silently drops a tagged frame for a VLAN it doesn't have or doesn't allow on that port. The DHCP request never left the first switch.</w:t>
+      </w:r>
+    </w:p>
+    <w:p>
+      <w:pPr>
+        <w:pStyle w:val="ListParagraph"/>
+        <w:numPr>
+          <w:ilvl w:val="0"/>
+          <w:numId w:val="2"/>
+        </w:numPr>
+      </w:pPr>
+      <w:r>
+        <w:rPr>
+          <w:rFonts w:ascii="Calibri" w:cs="Calibri" w:eastAsia="Calibri" w:hAnsi="Calibri"/>
+        </w:rPr>
+        <w:t xml:space="preserve">Why only member APs failed: clients on the VC AP never needed to cross the switches. That split points at a Layer 2 path problem, not RADIUS or DHCP.</w:t>
+      </w:r>
+    </w:p>
+    <w:p>
+      <w:pPr>
+        <w:pStyle w:val="ListParagraph"/>
+        <w:numPr>
+          <w:ilvl w:val="0"/>
+          <w:numId w:val="2"/>
+        </w:numPr>
+      </w:pPr>
+      <w:r>
+        <w:rPr>
+          <w:rFonts w:ascii="Calibri" w:cs="Calibri" w:eastAsia="Calibri" w:hAnsi="Calibri"/>
+        </w:rPr>
+        <w:t xml:space="preserve">Fix: create VLAN X on every switch in the path and allow it, tagged, on every AP port and every uplink back to the VC AP. With an unbroken Layer 2 path, DHCP, DNS and internet worked.</w:t>
+      </w:r>
+    </w:p>
+    <w:p>
+      <w:r>
+        <w:rPr>
+          <w:rFonts w:ascii="Calibri" w:cs="Calibri" w:eastAsia="Calibri" w:hAnsi="Calibri"/>
+          <w:b/>
+          <w:bCs/>
+        </w:rPr>
+        <w:t xml:space="preserve">Diagnosis commands</w:t>
+      </w:r>
+    </w:p>
+    <w:tbl>
+      <w:tblPr>
+        <w:tblW w:type="dxa" w:w="9026"/>
+        <w:tblBorders>
+          <w:top w:val="single" w:color="auto" w:sz="4"/>
+          <w:left w:val="single" w:color="auto" w:sz="4"/>
+          <w:bottom w:val="single" w:color="auto" w:sz="4"/>
+          <w:right w:val="single" w:color="auto" w:sz="4"/>
+          <w:insideH w:val="single" w:color="auto" w:sz="4"/>
+          <w:insideV w:val="single" w:color="auto" w:sz="4"/>
+        </w:tblBorders>
+      </w:tblPr>
+      <w:tblGrid>
+        <w:gridCol w:w="3953"/>
+        <w:gridCol w:w="2536"/>
+        <w:gridCol w:w="2537"/>
+      </w:tblGrid>
+      <w:tr>
+        <w:trPr>
+          <w:tblHeader/>
+        </w:trPr>
+        <w:tc>
+          <w:tcPr>
+            <w:tcW w:type="dxa" w:w="3953"/>
+            <w:tcBorders>
+              <w:top w:val="single" w:color="BFBFBF" w:sz="4"/>
+              <w:left w:val="single" w:color="BFBFBF" w:sz="4"/>
+              <w:bottom w:val="single" w:color="BFBFBF" w:sz="4"/>
+              <w:right w:val="single" w:color="BFBFBF" w:sz="4"/>
+            </w:tcBorders>
+            <w:shd w:fill="DCE6F1" w:color="auto" w:val="clear"/>
+            <w:tcMar>
+              <w:top w:type="dxa" w:w="60"/>
+              <w:left w:type="dxa" w:w="100"/>
+              <w:bottom w:type="dxa" w:w="60"/>
+              <w:right w:type="dxa" w:w="100"/>
+            </w:tcMar>
+          </w:tcPr>
+          <w:p>
+            <w:r>
+              <w:rPr>
+                <w:rFonts w:ascii="Calibri" w:cs="Calibri" w:eastAsia="Calibri" w:hAnsi="Calibri"/>
+                <w:b/>
+                <w:bCs/>
+                <w:sz w:val="19"/>
+                <w:szCs w:val="19"/>
+              </w:rPr>
+              <w:t xml:space="preserve">Check</w:t>
+            </w:r>
+          </w:p>
+        </w:tc>
+        <w:tc>
+          <w:tcPr>
+            <w:tcW w:type="dxa" w:w="2536"/>
+            <w:tcBorders>
+              <w:top w:val="single" w:color="BFBFBF" w:sz="4"/>
+              <w:left w:val="single" w:color="BFBFBF" w:sz="4"/>
+              <w:bottom w:val="single" w:color="BFBFBF" w:sz="4"/>
+              <w:right w:val="single" w:color="BFBFBF" w:sz="4"/>
+            </w:tcBorders>
+            <w:shd w:fill="DCE6F1" w:color="auto" w:val="clear"/>
+            <w:tcMar>
+              <w:top w:type="dxa" w:w="60"/>
+              <w:left w:type="dxa" w:w="100"/>
+              <w:bottom w:type="dxa" w:w="60"/>
+              <w:right w:type="dxa" w:w="100"/>
+            </w:tcMar>
+          </w:tcPr>
+          <w:p>
+            <w:r>
+              <w:rPr>
+                <w:rFonts w:ascii="Calibri" w:cs="Calibri" w:eastAsia="Calibri" w:hAnsi="Calibri"/>
+                <w:b/>
+                <w:bCs/>
+                <w:sz w:val="19"/>
+                <w:szCs w:val="19"/>
+              </w:rPr>
+              <w:t xml:space="preserve">Cisco</w:t>
+            </w:r>
+          </w:p>
+        </w:tc>
+        <w:tc>
+          <w:tcPr>
+            <w:tcW w:type="dxa" w:w="2537"/>
+            <w:tcBorders>
+              <w:top w:val="single" w:color="BFBFBF" w:sz="4"/>
+              <w:left w:val="single" w:color="BFBFBF" w:sz="4"/>
+              <w:bottom w:val="single" w:color="BFBFBF" w:sz="4"/>
+              <w:right w:val="single" w:color="BFBFBF" w:sz="4"/>
+            </w:tcBorders>
+            <w:shd w:fill="DCE6F1" w:color="auto" w:val="clear"/>
+            <w:tcMar>
+              <w:top w:type="dxa" w:w="60"/>
+              <w:left w:type="dxa" w:w="100"/>
+              <w:bottom w:type="dxa" w:w="60"/>
+              <w:right w:type="dxa" w:w="100"/>
+            </w:tcMar>
+          </w:tcPr>
+          <w:p>
+            <w:r>
+              <w:rPr>
+                <w:rFonts w:ascii="Calibri" w:cs="Calibri" w:eastAsia="Calibri" w:hAnsi="Calibri"/>
+                <w:b/>
+                <w:bCs/>
+                <w:sz w:val="19"/>
+                <w:szCs w:val="19"/>
+              </w:rPr>
+              <w:t xml:space="preserve">Aruba AOS-CX</w:t>
+            </w:r>
+          </w:p>
+        </w:tc>
+      </w:tr>
+      <w:tr>
+        <w:tc>
+          <w:tcPr>
+            <w:tcW w:type="dxa" w:w="3953"/>
+            <w:tcBorders>
+              <w:top w:val="single" w:color="BFBFBF" w:sz="4"/>
+              <w:left w:val="single" w:color="BFBFBF" w:sz="4"/>
+              <w:bottom w:val="single" w:color="BFBFBF" w:sz="4"/>
+              <w:right w:val="single" w:color="BFBFBF" w:sz="4"/>
+            </w:tcBorders>
+            <w:tcMar>
+              <w:top w:type="dxa" w:w="60"/>
+              <w:left w:type="dxa" w:w="100"/>
+              <w:bottom w:type="dxa" w:w="60"/>
+              <w:right w:type="dxa" w:w="100"/>
+            </w:tcMar>
+          </w:tcPr>
+          <w:p>
+            <w:r>
+              <w:rPr>
+                <w:rFonts w:ascii="Calibri" w:cs="Calibri" w:eastAsia="Calibri" w:hAnsi="Calibri"/>
+                <w:sz w:val="19"/>
+                <w:szCs w:val="19"/>
+              </w:rPr>
+              <w:t xml:space="preserve">VLAN exists on the switch</w:t>
+            </w:r>
+          </w:p>
+        </w:tc>
+        <w:tc>
+          <w:tcPr>
+            <w:tcW w:type="dxa" w:w="2536"/>
+            <w:tcBorders>
+              <w:top w:val="single" w:color="BFBFBF" w:sz="4"/>
+              <w:left w:val="single" w:color="BFBFBF" w:sz="4"/>
+              <w:bottom w:val="single" w:color="BFBFBF" w:sz="4"/>
+              <w:right w:val="single" w:color="BFBFBF" w:sz="4"/>
+            </w:tcBorders>
+            <w:tcMar>
+              <w:top w:type="dxa" w:w="60"/>
+              <w:left w:type="dxa" w:w="100"/>
+              <w:bottom w:type="dxa" w:w="60"/>
+              <w:right w:type="dxa" w:w="100"/>
+            </w:tcMar>
+          </w:tcPr>
+          <w:p>
+            <w:r>
+              <w:rPr>
+                <w:rFonts w:ascii="Consolas" w:cs="Consolas" w:eastAsia="Consolas" w:hAnsi="Consolas"/>
+                <w:sz w:val="19"/>
+                <w:szCs w:val="19"/>
+              </w:rPr>
+              <w:t xml:space="preserve">show vlan brief</w:t>
+            </w:r>
+          </w:p>
+        </w:tc>
+        <w:tc>
+          <w:tcPr>
+            <w:tcW w:type="dxa" w:w="2537"/>
+            <w:tcBorders>
+              <w:top w:val="single" w:color="BFBFBF" w:sz="4"/>
+              <w:left w:val="single" w:color="BFBFBF" w:sz="4"/>
+              <w:bottom w:val="single" w:color="BFBFBF" w:sz="4"/>
+              <w:right w:val="single" w:color="BFBFBF" w:sz="4"/>
+            </w:tcBorders>
+            <w:tcMar>
+              <w:top w:type="dxa" w:w="60"/>
+              <w:left w:type="dxa" w:w="100"/>
+              <w:bottom w:type="dxa" w:w="60"/>
+              <w:right w:type="dxa" w:w="100"/>
+            </w:tcMar>
+          </w:tcPr>
+          <w:p>
+            <w:r>
+              <w:rPr>
+                <w:rFonts w:ascii="Consolas" w:cs="Consolas" w:eastAsia="Consolas" w:hAnsi="Consolas"/>
+                <w:sz w:val="19"/>
+                <w:szCs w:val="19"/>
+              </w:rPr>
+              <w:t xml:space="preserve">show vlan</w:t>
+            </w:r>
+          </w:p>
+        </w:tc>
+      </w:tr>
+      <w:tr>
+        <w:tc>
+          <w:tcPr>
+            <w:tcW w:type="dxa" w:w="3953"/>
+            <w:tcBorders>
+              <w:top w:val="single" w:color="BFBFBF" w:sz="4"/>
+              <w:left w:val="single" w:color="BFBFBF" w:sz="4"/>
+              <w:bottom w:val="single" w:color="BFBFBF" w:sz="4"/>
+              <w:right w:val="single" w:color="BFBFBF" w:sz="4"/>
+            </w:tcBorders>
+            <w:tcMar>
+              <w:top w:type="dxa" w:w="60"/>
+              <w:left w:type="dxa" w:w="100"/>
+              <w:bottom w:type="dxa" w:w="60"/>
+              <w:right w:type="dxa" w:w="100"/>
+            </w:tcMar>
+          </w:tcPr>
+          <w:p>
+            <w:r>
+              <w:rPr>
+                <w:rFonts w:ascii="Calibri" w:cs="Calibri" w:eastAsia="Calibri" w:hAnsi="Calibri"/>
+                <w:sz w:val="19"/>
+                <w:szCs w:val="19"/>
+              </w:rPr>
+              <w:t xml:space="preserve">VLAN allowed on AP port / uplink</w:t>
+            </w:r>
+          </w:p>
+        </w:tc>
+        <w:tc>
+          <w:tcPr>
+            <w:tcW w:type="dxa" w:w="2536"/>
+            <w:tcBorders>
+              <w:top w:val="single" w:color="BFBFBF" w:sz="4"/>
+              <w:left w:val="single" w:color="BFBFBF" w:sz="4"/>
+              <w:bottom w:val="single" w:color="BFBFBF" w:sz="4"/>
+              <w:right w:val="single" w:color="BFBFBF" w:sz="4"/>
+            </w:tcBorders>
+            <w:tcMar>
+              <w:top w:type="dxa" w:w="60"/>
+              <w:left w:type="dxa" w:w="100"/>
+              <w:bottom w:type="dxa" w:w="60"/>
+              <w:right w:type="dxa" w:w="100"/>
+            </w:tcMar>
+          </w:tcPr>
+          <w:p>
+            <w:r>
+              <w:rPr>
+                <w:rFonts w:ascii="Consolas" w:cs="Consolas" w:eastAsia="Consolas" w:hAnsi="Consolas"/>
+                <w:sz w:val="19"/>
+                <w:szCs w:val="19"/>
+              </w:rPr>
+              <w:t xml:space="preserve">show interfaces trunk</w:t>
+            </w:r>
+          </w:p>
+        </w:tc>
+        <w:tc>
+          <w:tcPr>
+            <w:tcW w:type="dxa" w:w="2537"/>
+            <w:tcBorders>
+              <w:top w:val="single" w:color="BFBFBF" w:sz="4"/>
+              <w:left w:val="single" w:color="BFBFBF" w:sz="4"/>
+              <w:bottom w:val="single" w:color="BFBFBF" w:sz="4"/>
+              <w:right w:val="single" w:color="BFBFBF" w:sz="4"/>
+            </w:tcBorders>
+            <w:tcMar>
+              <w:top w:type="dxa" w:w="60"/>
+              <w:left w:type="dxa" w:w="100"/>
+              <w:bottom w:type="dxa" w:w="60"/>
+              <w:right w:type="dxa" w:w="100"/>
+            </w:tcMar>
+          </w:tcPr>
+          <w:p>
+            <w:r>
+              <w:rPr>
+                <w:rFonts w:ascii="Consolas" w:cs="Consolas" w:eastAsia="Consolas" w:hAnsi="Consolas"/>
+                <w:sz w:val="19"/>
+                <w:szCs w:val="19"/>
+              </w:rPr>
+              <w:t xml:space="preserve">show vlan port &lt;port&gt;</w:t>
+            </w:r>
+          </w:p>
+        </w:tc>
+      </w:tr>
+      <w:tr>
+        <w:tc>
+          <w:tcPr>
+            <w:tcW w:type="dxa" w:w="3953"/>
+            <w:tcBorders>
+              <w:top w:val="single" w:color="BFBFBF" w:sz="4"/>
+              <w:left w:val="single" w:color="BFBFBF" w:sz="4"/>
+              <w:bottom w:val="single" w:color="BFBFBF" w:sz="4"/>
+              <w:right w:val="single" w:color="BFBFBF" w:sz="4"/>
+            </w:tcBorders>
+            <w:tcMar>
+              <w:top w:type="dxa" w:w="60"/>
+              <w:left w:type="dxa" w:w="100"/>
+              <w:bottom w:type="dxa" w:w="60"/>
+              <w:right w:type="dxa" w:w="100"/>
+            </w:tcMar>
+          </w:tcPr>
+          <w:p>
+            <w:r>
+              <w:rPr>
+                <w:rFonts w:ascii="Calibri" w:cs="Calibri" w:eastAsia="Calibri" w:hAnsi="Calibri"/>
+                <w:sz w:val="19"/>
+                <w:szCs w:val="19"/>
+              </w:rPr>
+              <w:t xml:space="preserve">Client MAC learned in the VLAN (follow it hop by hop)</w:t>
+            </w:r>
+          </w:p>
+        </w:tc>
+        <w:tc>
+          <w:tcPr>
+            <w:tcW w:type="dxa" w:w="2536"/>
+            <w:tcBorders>
+              <w:top w:val="single" w:color="BFBFBF" w:sz="4"/>
+              <w:left w:val="single" w:color="BFBFBF" w:sz="4"/>
+              <w:bottom w:val="single" w:color="BFBFBF" w:sz="4"/>
+              <w:right w:val="single" w:color="BFBFBF" w:sz="4"/>
+            </w:tcBorders>
+            <w:tcMar>
+              <w:top w:type="dxa" w:w="60"/>
+              <w:left w:type="dxa" w:w="100"/>
+              <w:bottom w:type="dxa" w:w="60"/>
+              <w:right w:type="dxa" w:w="100"/>
+            </w:tcMar>
+          </w:tcPr>
+          <w:p>
+            <w:r>
+              <w:rPr>
+                <w:rFonts w:ascii="Consolas" w:cs="Consolas" w:eastAsia="Consolas" w:hAnsi="Consolas"/>
+                <w:sz w:val="19"/>
+                <w:szCs w:val="19"/>
+              </w:rPr>
+              <w:t xml:space="preserve">show mac address-table vlan &lt;id&gt;</w:t>
+            </w:r>
+          </w:p>
+        </w:tc>
+        <w:tc>
+          <w:tcPr>
+            <w:tcW w:type="dxa" w:w="2537"/>
+            <w:tcBorders>
+              <w:top w:val="single" w:color="BFBFBF" w:sz="4"/>
+              <w:left w:val="single" w:color="BFBFBF" w:sz="4"/>
+              <w:bottom w:val="single" w:color="BFBFBF" w:sz="4"/>
+              <w:right w:val="single" w:color="BFBFBF" w:sz="4"/>
+            </w:tcBorders>
+            <w:tcMar>
+              <w:top w:type="dxa" w:w="60"/>
+              <w:left w:type="dxa" w:w="100"/>
+              <w:bottom w:type="dxa" w:w="60"/>
+              <w:right w:type="dxa" w:w="100"/>
+            </w:tcMar>
+          </w:tcPr>
+          <w:p>
+            <w:r>
+              <w:rPr>
+                <w:rFonts w:ascii="Consolas" w:cs="Consolas" w:eastAsia="Consolas" w:hAnsi="Consolas"/>
+                <w:sz w:val="19"/>
+                <w:szCs w:val="19"/>
+              </w:rPr>
+              <w:t xml:space="preserve">show mac-address-table vlan &lt;id&gt;</w:t>
+            </w:r>
+          </w:p>
+        </w:tc>
+      </w:tr>
+    </w:tbl>
+    <w:p/>
+    <w:p>
+      <w:r>
+        <w:rPr>
+          <w:rFonts w:ascii="Calibri" w:cs="Calibri" w:eastAsia="Calibri" w:hAnsi="Calibri"/>
+          <w:b/>
+          <w:bCs/>
+        </w:rPr>
+        <w:t xml:space="preserve">Takeaway / next action</w:t>
+      </w:r>
+    </w:p>
+    <w:p>
+      <w:r>
+        <w:rPr>
+          <w:rFonts w:ascii="Calibri" w:cs="Calibri" w:eastAsia="Calibri" w:hAnsi="Calibri"/>
+        </w:rPr>
+        <w:t xml:space="preserve">With dynamic VLAN assignment, a VLAN must be carried on every path from every AP to wherever that VLAN is forwarded (here, the VC AP), not just the ports you expected to use it. When some wireless clients get no IP and others are fine, compare which AP they're on: if only member APs fail, trace the VLAN hop by hop with the MAC address table — the switch where the client's MAC stops appearing is where the traffic is being dropped.</w:t>
       </w:r>
     </w:p>
     <w:sectPr>

</xml_diff>

<commit_message>
Add study path beyond the CCNA to CCNA vs Real World
Co-Authored-By: Claude Opus 5.5 <noreply@anthropic.com>
Claude-Session: https://claude.ai/code/session_01DZwzvGP29kTgZHNh8Sqgpd
</commit_message>
<xml_diff>
--- a/real-world/CCNA_vs_RealWorld.docx
+++ b/real-world/CCNA_vs_RealWorld.docx
@@ -101,6 +101,1096 @@
           <w:rFonts w:ascii="Calibri" w:cs="Calibri" w:eastAsia="Calibri" w:hAnsi="Calibri"/>
         </w:rPr>
         <w:t xml:space="preserve">All IPs, hostnames, URLs and internal system names are replaced with generic placeholders.</w:t>
+      </w:r>
+    </w:p>
+    <w:p>
+      <w:pPr>
+        <w:pStyle w:val="Heading2"/>
+      </w:pPr>
+      <w:r>
+        <w:rPr>
+          <w:rFonts w:ascii="Calibri" w:cs="Calibri" w:eastAsia="Calibri" w:hAnsi="Calibri"/>
+        </w:rPr>
+        <w:t xml:space="preserve">Study Path Beyond the CCNA</w:t>
+      </w:r>
+    </w:p>
+    <w:p>
+      <w:r>
+        <w:rPr>
+          <w:rFonts w:ascii="Calibri" w:cs="Calibri" w:eastAsia="Calibri" w:hAnsi="Calibri"/>
+          <w:b/>
+          <w:bCs/>
+        </w:rPr>
+        <w:t xml:space="preserve">📊 Level:</w:t>
+      </w:r>
+      <w:r>
+        <w:rPr>
+          <w:rFonts w:ascii="Calibri" w:cs="Calibri" w:eastAsia="Calibri" w:hAnsi="Calibri"/>
+        </w:rPr>
+        <w:t xml:space="preserve"> CCNA → CCNP + Vendor — maps the topics in these notes and the SOPs to the course or exam that teaches them.</w:t>
+      </w:r>
+    </w:p>
+    <w:p>
+      <w:r>
+        <w:rPr>
+          <w:rFonts w:ascii="Calibri" w:cs="Calibri" w:eastAsia="Calibri" w:hAnsi="Calibri"/>
+          <w:b/>
+          <w:bCs/>
+        </w:rPr>
+        <w:t xml:space="preserve">⚙ Work reference —</w:t>
+      </w:r>
+      <w:r>
+        <w:rPr>
+          <w:rFonts w:ascii="Calibri" w:cs="Calibri" w:eastAsia="Calibri" w:hAnsi="Calibri"/>
+        </w:rPr>
+        <w:t xml:space="preserve"> most real issues in these notes go past the CCNA. This is where each one is taught, so study can follow the work.</w:t>
+      </w:r>
+    </w:p>
+    <w:tbl>
+      <w:tblPr>
+        <w:tblW w:type="dxa" w:w="9026"/>
+        <w:tblBorders>
+          <w:top w:val="single" w:color="auto" w:sz="4"/>
+          <w:left w:val="single" w:color="auto" w:sz="4"/>
+          <w:bottom w:val="single" w:color="auto" w:sz="4"/>
+          <w:right w:val="single" w:color="auto" w:sz="4"/>
+          <w:insideH w:val="single" w:color="auto" w:sz="4"/>
+          <w:insideV w:val="single" w:color="auto" w:sz="4"/>
+        </w:tblBorders>
+      </w:tblPr>
+      <w:tblGrid>
+        <w:gridCol w:w="5680"/>
+        <w:gridCol w:w="3346"/>
+      </w:tblGrid>
+      <w:tr>
+        <w:trPr>
+          <w:tblHeader/>
+        </w:trPr>
+        <w:tc>
+          <w:tcPr>
+            <w:tcW w:type="dxa" w:w="5680"/>
+            <w:tcBorders>
+              <w:top w:val="single" w:color="BFBFBF" w:sz="4"/>
+              <w:left w:val="single" w:color="BFBFBF" w:sz="4"/>
+              <w:bottom w:val="single" w:color="BFBFBF" w:sz="4"/>
+              <w:right w:val="single" w:color="BFBFBF" w:sz="4"/>
+            </w:tcBorders>
+            <w:shd w:fill="DCE6F1" w:color="auto" w:val="clear"/>
+            <w:tcMar>
+              <w:top w:type="dxa" w:w="60"/>
+              <w:left w:type="dxa" w:w="100"/>
+              <w:bottom w:type="dxa" w:w="60"/>
+              <w:right w:type="dxa" w:w="100"/>
+            </w:tcMar>
+          </w:tcPr>
+          <w:p>
+            <w:r>
+              <w:rPr>
+                <w:rFonts w:ascii="Calibri" w:cs="Calibri" w:eastAsia="Calibri" w:hAnsi="Calibri"/>
+                <w:b/>
+                <w:bCs/>
+                <w:sz w:val="19"/>
+                <w:szCs w:val="19"/>
+              </w:rPr>
+              <w:t xml:space="preserve">Topic</w:t>
+            </w:r>
+          </w:p>
+        </w:tc>
+        <w:tc>
+          <w:tcPr>
+            <w:tcW w:type="dxa" w:w="3346"/>
+            <w:tcBorders>
+              <w:top w:val="single" w:color="BFBFBF" w:sz="4"/>
+              <w:left w:val="single" w:color="BFBFBF" w:sz="4"/>
+              <w:bottom w:val="single" w:color="BFBFBF" w:sz="4"/>
+              <w:right w:val="single" w:color="BFBFBF" w:sz="4"/>
+            </w:tcBorders>
+            <w:shd w:fill="DCE6F1" w:color="auto" w:val="clear"/>
+            <w:tcMar>
+              <w:top w:type="dxa" w:w="60"/>
+              <w:left w:type="dxa" w:w="100"/>
+              <w:bottom w:type="dxa" w:w="60"/>
+              <w:right w:type="dxa" w:w="100"/>
+            </w:tcMar>
+          </w:tcPr>
+          <w:p>
+            <w:r>
+              <w:rPr>
+                <w:rFonts w:ascii="Calibri" w:cs="Calibri" w:eastAsia="Calibri" w:hAnsi="Calibri"/>
+                <w:b/>
+                <w:bCs/>
+                <w:sz w:val="19"/>
+                <w:szCs w:val="19"/>
+              </w:rPr>
+              <w:t xml:space="preserve">Course / exam</w:t>
+            </w:r>
+          </w:p>
+        </w:tc>
+      </w:tr>
+      <w:tr>
+        <w:tc>
+          <w:tcPr>
+            <w:tcW w:type="dxa" w:w="5680"/>
+            <w:tcBorders>
+              <w:top w:val="single" w:color="BFBFBF" w:sz="4"/>
+              <w:left w:val="single" w:color="BFBFBF" w:sz="4"/>
+              <w:bottom w:val="single" w:color="BFBFBF" w:sz="4"/>
+              <w:right w:val="single" w:color="BFBFBF" w:sz="4"/>
+            </w:tcBorders>
+            <w:tcMar>
+              <w:top w:type="dxa" w:w="60"/>
+              <w:left w:type="dxa" w:w="100"/>
+              <w:bottom w:type="dxa" w:w="60"/>
+              <w:right w:type="dxa" w:w="100"/>
+            </w:tcMar>
+          </w:tcPr>
+          <w:p>
+            <w:r>
+              <w:rPr>
+                <w:rFonts w:ascii="Calibri" w:cs="Calibri" w:eastAsia="Calibri" w:hAnsi="Calibri"/>
+                <w:sz w:val="19"/>
+                <w:szCs w:val="19"/>
+              </w:rPr>
+              <w:t xml:space="preserve">VLANs, trunks, STP, OSPF, NAT, 802.1X basics</w:t>
+            </w:r>
+          </w:p>
+        </w:tc>
+        <w:tc>
+          <w:tcPr>
+            <w:tcW w:type="dxa" w:w="3346"/>
+            <w:tcBorders>
+              <w:top w:val="single" w:color="BFBFBF" w:sz="4"/>
+              <w:left w:val="single" w:color="BFBFBF" w:sz="4"/>
+              <w:bottom w:val="single" w:color="BFBFBF" w:sz="4"/>
+              <w:right w:val="single" w:color="BFBFBF" w:sz="4"/>
+            </w:tcBorders>
+            <w:tcMar>
+              <w:top w:type="dxa" w:w="60"/>
+              <w:left w:type="dxa" w:w="100"/>
+              <w:bottom w:type="dxa" w:w="60"/>
+              <w:right w:type="dxa" w:w="100"/>
+            </w:tcMar>
+          </w:tcPr>
+          <w:p>
+            <w:r>
+              <w:rPr>
+                <w:rFonts w:ascii="Calibri" w:cs="Calibri" w:eastAsia="Calibri" w:hAnsi="Calibri"/>
+                <w:b/>
+                <w:bCs/>
+                <w:sz w:val="19"/>
+                <w:szCs w:val="19"/>
+              </w:rPr>
+              <w:t xml:space="preserve">CCNA</w:t>
+            </w:r>
+            <w:r>
+              <w:rPr>
+                <w:rFonts w:ascii="Calibri" w:cs="Calibri" w:eastAsia="Calibri" w:hAnsi="Calibri"/>
+                <w:sz w:val="19"/>
+                <w:szCs w:val="19"/>
+              </w:rPr>
+              <w:t xml:space="preserve"> (200-301) — current</w:t>
+            </w:r>
+          </w:p>
+        </w:tc>
+      </w:tr>
+      <w:tr>
+        <w:tc>
+          <w:tcPr>
+            <w:tcW w:type="dxa" w:w="5680"/>
+            <w:tcBorders>
+              <w:top w:val="single" w:color="BFBFBF" w:sz="4"/>
+              <w:left w:val="single" w:color="BFBFBF" w:sz="4"/>
+              <w:bottom w:val="single" w:color="BFBFBF" w:sz="4"/>
+              <w:right w:val="single" w:color="BFBFBF" w:sz="4"/>
+            </w:tcBorders>
+            <w:tcMar>
+              <w:top w:type="dxa" w:w="60"/>
+              <w:left w:type="dxa" w:w="100"/>
+              <w:bottom w:type="dxa" w:w="60"/>
+              <w:right w:type="dxa" w:w="100"/>
+            </w:tcMar>
+          </w:tcPr>
+          <w:p>
+            <w:r>
+              <w:rPr>
+                <w:rFonts w:ascii="Calibri" w:cs="Calibri" w:eastAsia="Calibri" w:hAnsi="Calibri"/>
+                <w:sz w:val="19"/>
+                <w:szCs w:val="19"/>
+              </w:rPr>
+              <w:t xml:space="preserve">Switch/router upgrades, backups, </w:t>
+            </w:r>
+            <w:r>
+              <w:rPr>
+                <w:rFonts w:ascii="Consolas" w:cs="Consolas" w:eastAsia="Consolas" w:hAnsi="Consolas"/>
+                <w:sz w:val="19"/>
+                <w:szCs w:val="19"/>
+              </w:rPr>
+              <w:t xml:space="preserve">configure replace</w:t>
+            </w:r>
+            <w:r>
+              <w:rPr>
+                <w:rFonts w:ascii="Calibri" w:cs="Calibri" w:eastAsia="Calibri" w:hAnsi="Calibri"/>
+                <w:sz w:val="19"/>
+                <w:szCs w:val="19"/>
+              </w:rPr>
+              <w:t xml:space="preserve">, HA, wireless basics, SD-WAN basics, automation</w:t>
+            </w:r>
+          </w:p>
+        </w:tc>
+        <w:tc>
+          <w:tcPr>
+            <w:tcW w:type="dxa" w:w="3346"/>
+            <w:tcBorders>
+              <w:top w:val="single" w:color="BFBFBF" w:sz="4"/>
+              <w:left w:val="single" w:color="BFBFBF" w:sz="4"/>
+              <w:bottom w:val="single" w:color="BFBFBF" w:sz="4"/>
+              <w:right w:val="single" w:color="BFBFBF" w:sz="4"/>
+            </w:tcBorders>
+            <w:tcMar>
+              <w:top w:type="dxa" w:w="60"/>
+              <w:left w:type="dxa" w:w="100"/>
+              <w:bottom w:type="dxa" w:w="60"/>
+              <w:right w:type="dxa" w:w="100"/>
+            </w:tcMar>
+          </w:tcPr>
+          <w:p>
+            <w:r>
+              <w:rPr>
+                <w:rFonts w:ascii="Calibri" w:cs="Calibri" w:eastAsia="Calibri" w:hAnsi="Calibri"/>
+                <w:b/>
+                <w:bCs/>
+                <w:sz w:val="19"/>
+                <w:szCs w:val="19"/>
+              </w:rPr>
+              <w:t xml:space="preserve">CCNP Enterprise core: ENCOR</w:t>
+            </w:r>
+            <w:r>
+              <w:rPr>
+                <w:rFonts w:ascii="Calibri" w:cs="Calibri" w:eastAsia="Calibri" w:hAnsi="Calibri"/>
+                <w:sz w:val="19"/>
+                <w:szCs w:val="19"/>
+              </w:rPr>
+              <w:t xml:space="preserve"> (350-401)</w:t>
+            </w:r>
+          </w:p>
+        </w:tc>
+      </w:tr>
+      <w:tr>
+        <w:tc>
+          <w:tcPr>
+            <w:tcW w:type="dxa" w:w="5680"/>
+            <w:tcBorders>
+              <w:top w:val="single" w:color="BFBFBF" w:sz="4"/>
+              <w:left w:val="single" w:color="BFBFBF" w:sz="4"/>
+              <w:bottom w:val="single" w:color="BFBFBF" w:sz="4"/>
+              <w:right w:val="single" w:color="BFBFBF" w:sz="4"/>
+            </w:tcBorders>
+            <w:tcMar>
+              <w:top w:type="dxa" w:w="60"/>
+              <w:left w:type="dxa" w:w="100"/>
+              <w:bottom w:type="dxa" w:w="60"/>
+              <w:right w:type="dxa" w:w="100"/>
+            </w:tcMar>
+          </w:tcPr>
+          <w:p>
+            <w:r>
+              <w:rPr>
+                <w:rFonts w:ascii="Calibri" w:cs="Calibri" w:eastAsia="Calibri" w:hAnsi="Calibri"/>
+                <w:sz w:val="19"/>
+                <w:szCs w:val="19"/>
+              </w:rPr>
+              <w:t xml:space="preserve">Advanced routing, VRF-lite, route filtering, DHCP/relay, VPNs, troubleshooting</w:t>
+            </w:r>
+          </w:p>
+        </w:tc>
+        <w:tc>
+          <w:tcPr>
+            <w:tcW w:type="dxa" w:w="3346"/>
+            <w:tcBorders>
+              <w:top w:val="single" w:color="BFBFBF" w:sz="4"/>
+              <w:left w:val="single" w:color="BFBFBF" w:sz="4"/>
+              <w:bottom w:val="single" w:color="BFBFBF" w:sz="4"/>
+              <w:right w:val="single" w:color="BFBFBF" w:sz="4"/>
+            </w:tcBorders>
+            <w:tcMar>
+              <w:top w:type="dxa" w:w="60"/>
+              <w:left w:type="dxa" w:w="100"/>
+              <w:bottom w:type="dxa" w:w="60"/>
+              <w:right w:type="dxa" w:w="100"/>
+            </w:tcMar>
+          </w:tcPr>
+          <w:p>
+            <w:r>
+              <w:rPr>
+                <w:rFonts w:ascii="Calibri" w:cs="Calibri" w:eastAsia="Calibri" w:hAnsi="Calibri"/>
+                <w:b/>
+                <w:bCs/>
+                <w:sz w:val="19"/>
+                <w:szCs w:val="19"/>
+              </w:rPr>
+              <w:t xml:space="preserve">ENARSI</w:t>
+            </w:r>
+            <w:r>
+              <w:rPr>
+                <w:rFonts w:ascii="Calibri" w:cs="Calibri" w:eastAsia="Calibri" w:hAnsi="Calibri"/>
+                <w:sz w:val="19"/>
+                <w:szCs w:val="19"/>
+              </w:rPr>
+              <w:t xml:space="preserve"> (300-410) — CCNP Enterprise concentration</w:t>
+            </w:r>
+          </w:p>
+        </w:tc>
+      </w:tr>
+      <w:tr>
+        <w:tc>
+          <w:tcPr>
+            <w:tcW w:type="dxa" w:w="5680"/>
+            <w:tcBorders>
+              <w:top w:val="single" w:color="BFBFBF" w:sz="4"/>
+              <w:left w:val="single" w:color="BFBFBF" w:sz="4"/>
+              <w:bottom w:val="single" w:color="BFBFBF" w:sz="4"/>
+              <w:right w:val="single" w:color="BFBFBF" w:sz="4"/>
+            </w:tcBorders>
+            <w:tcMar>
+              <w:top w:type="dxa" w:w="60"/>
+              <w:left w:type="dxa" w:w="100"/>
+              <w:bottom w:type="dxa" w:w="60"/>
+              <w:right w:type="dxa" w:w="100"/>
+            </w:tcMar>
+          </w:tcPr>
+          <w:p>
+            <w:r>
+              <w:rPr>
+                <w:rFonts w:ascii="Calibri" w:cs="Calibri" w:eastAsia="Calibri" w:hAnsi="Calibri"/>
+                <w:sz w:val="19"/>
+                <w:szCs w:val="19"/>
+              </w:rPr>
+              <w:t xml:space="preserve">Catalyst 9800 WLC, AP join, RADIUS VLAN assignment, wireless troubleshooting</w:t>
+            </w:r>
+          </w:p>
+        </w:tc>
+        <w:tc>
+          <w:tcPr>
+            <w:tcW w:type="dxa" w:w="3346"/>
+            <w:tcBorders>
+              <w:top w:val="single" w:color="BFBFBF" w:sz="4"/>
+              <w:left w:val="single" w:color="BFBFBF" w:sz="4"/>
+              <w:bottom w:val="single" w:color="BFBFBF" w:sz="4"/>
+              <w:right w:val="single" w:color="BFBFBF" w:sz="4"/>
+            </w:tcBorders>
+            <w:tcMar>
+              <w:top w:type="dxa" w:w="60"/>
+              <w:left w:type="dxa" w:w="100"/>
+              <w:bottom w:type="dxa" w:w="60"/>
+              <w:right w:type="dxa" w:w="100"/>
+            </w:tcMar>
+          </w:tcPr>
+          <w:p>
+            <w:r>
+              <w:rPr>
+                <w:rFonts w:ascii="Calibri" w:cs="Calibri" w:eastAsia="Calibri" w:hAnsi="Calibri"/>
+                <w:b/>
+                <w:bCs/>
+                <w:sz w:val="19"/>
+                <w:szCs w:val="19"/>
+              </w:rPr>
+              <w:t xml:space="preserve">ENWLSI</w:t>
+            </w:r>
+            <w:r>
+              <w:rPr>
+                <w:rFonts w:ascii="Calibri" w:cs="Calibri" w:eastAsia="Calibri" w:hAnsi="Calibri"/>
+                <w:sz w:val="19"/>
+                <w:szCs w:val="19"/>
+              </w:rPr>
+              <w:t xml:space="preserve"> (300-430) — wireless implementation</w:t>
+            </w:r>
+          </w:p>
+        </w:tc>
+      </w:tr>
+      <w:tr>
+        <w:tc>
+          <w:tcPr>
+            <w:tcW w:type="dxa" w:w="5680"/>
+            <w:tcBorders>
+              <w:top w:val="single" w:color="BFBFBF" w:sz="4"/>
+              <w:left w:val="single" w:color="BFBFBF" w:sz="4"/>
+              <w:bottom w:val="single" w:color="BFBFBF" w:sz="4"/>
+              <w:right w:val="single" w:color="BFBFBF" w:sz="4"/>
+            </w:tcBorders>
+            <w:tcMar>
+              <w:top w:type="dxa" w:w="60"/>
+              <w:left w:type="dxa" w:w="100"/>
+              <w:bottom w:type="dxa" w:w="60"/>
+              <w:right w:type="dxa" w:w="100"/>
+            </w:tcMar>
+          </w:tcPr>
+          <w:p>
+            <w:r>
+              <w:rPr>
+                <w:rFonts w:ascii="Calibri" w:cs="Calibri" w:eastAsia="Calibri" w:hAnsi="Calibri"/>
+                <w:sz w:val="19"/>
+                <w:szCs w:val="19"/>
+              </w:rPr>
+              <w:t xml:space="preserve">Catalyst SD-WAN (vManage, edges, onboarding)</w:t>
+            </w:r>
+          </w:p>
+        </w:tc>
+        <w:tc>
+          <w:tcPr>
+            <w:tcW w:type="dxa" w:w="3346"/>
+            <w:tcBorders>
+              <w:top w:val="single" w:color="BFBFBF" w:sz="4"/>
+              <w:left w:val="single" w:color="BFBFBF" w:sz="4"/>
+              <w:bottom w:val="single" w:color="BFBFBF" w:sz="4"/>
+              <w:right w:val="single" w:color="BFBFBF" w:sz="4"/>
+            </w:tcBorders>
+            <w:tcMar>
+              <w:top w:type="dxa" w:w="60"/>
+              <w:left w:type="dxa" w:w="100"/>
+              <w:bottom w:type="dxa" w:w="60"/>
+              <w:right w:type="dxa" w:w="100"/>
+            </w:tcMar>
+          </w:tcPr>
+          <w:p>
+            <w:r>
+              <w:rPr>
+                <w:rFonts w:ascii="Calibri" w:cs="Calibri" w:eastAsia="Calibri" w:hAnsi="Calibri"/>
+                <w:b/>
+                <w:bCs/>
+                <w:sz w:val="19"/>
+                <w:szCs w:val="19"/>
+              </w:rPr>
+              <w:t xml:space="preserve">ENSDWI</w:t>
+            </w:r>
+            <w:r>
+              <w:rPr>
+                <w:rFonts w:ascii="Calibri" w:cs="Calibri" w:eastAsia="Calibri" w:hAnsi="Calibri"/>
+                <w:sz w:val="19"/>
+                <w:szCs w:val="19"/>
+              </w:rPr>
+              <w:t xml:space="preserve"> (300-415)</w:t>
+            </w:r>
+          </w:p>
+        </w:tc>
+      </w:tr>
+      <w:tr>
+        <w:tc>
+          <w:tcPr>
+            <w:tcW w:type="dxa" w:w="5680"/>
+            <w:tcBorders>
+              <w:top w:val="single" w:color="BFBFBF" w:sz="4"/>
+              <w:left w:val="single" w:color="BFBFBF" w:sz="4"/>
+              <w:bottom w:val="single" w:color="BFBFBF" w:sz="4"/>
+              <w:right w:val="single" w:color="BFBFBF" w:sz="4"/>
+            </w:tcBorders>
+            <w:tcMar>
+              <w:top w:type="dxa" w:w="60"/>
+              <w:left w:type="dxa" w:w="100"/>
+              <w:bottom w:type="dxa" w:w="60"/>
+              <w:right w:type="dxa" w:w="100"/>
+            </w:tcMar>
+          </w:tcPr>
+          <w:p>
+            <w:r>
+              <w:rPr>
+                <w:rFonts w:ascii="Calibri" w:cs="Calibri" w:eastAsia="Calibri" w:hAnsi="Calibri"/>
+                <w:sz w:val="19"/>
+                <w:szCs w:val="19"/>
+              </w:rPr>
+              <w:t xml:space="preserve">Ansible, APIs, Catalyst Center automation</w:t>
+            </w:r>
+          </w:p>
+        </w:tc>
+        <w:tc>
+          <w:tcPr>
+            <w:tcW w:type="dxa" w:w="3346"/>
+            <w:tcBorders>
+              <w:top w:val="single" w:color="BFBFBF" w:sz="4"/>
+              <w:left w:val="single" w:color="BFBFBF" w:sz="4"/>
+              <w:bottom w:val="single" w:color="BFBFBF" w:sz="4"/>
+              <w:right w:val="single" w:color="BFBFBF" w:sz="4"/>
+            </w:tcBorders>
+            <w:tcMar>
+              <w:top w:type="dxa" w:w="60"/>
+              <w:left w:type="dxa" w:w="100"/>
+              <w:bottom w:type="dxa" w:w="60"/>
+              <w:right w:type="dxa" w:w="100"/>
+            </w:tcMar>
+          </w:tcPr>
+          <w:p>
+            <w:r>
+              <w:rPr>
+                <w:rFonts w:ascii="Calibri" w:cs="Calibri" w:eastAsia="Calibri" w:hAnsi="Calibri"/>
+                <w:b/>
+                <w:bCs/>
+                <w:sz w:val="19"/>
+                <w:szCs w:val="19"/>
+              </w:rPr>
+              <w:t xml:space="preserve">ENAUTO</w:t>
+            </w:r>
+            <w:r>
+              <w:rPr>
+                <w:rFonts w:ascii="Calibri" w:cs="Calibri" w:eastAsia="Calibri" w:hAnsi="Calibri"/>
+                <w:sz w:val="19"/>
+                <w:szCs w:val="19"/>
+              </w:rPr>
+              <w:t xml:space="preserve"> (300-435)</w:t>
+            </w:r>
+          </w:p>
+        </w:tc>
+      </w:tr>
+      <w:tr>
+        <w:tc>
+          <w:tcPr>
+            <w:tcW w:type="dxa" w:w="5680"/>
+            <w:tcBorders>
+              <w:top w:val="single" w:color="BFBFBF" w:sz="4"/>
+              <w:left w:val="single" w:color="BFBFBF" w:sz="4"/>
+              <w:bottom w:val="single" w:color="BFBFBF" w:sz="4"/>
+              <w:right w:val="single" w:color="BFBFBF" w:sz="4"/>
+            </w:tcBorders>
+            <w:tcMar>
+              <w:top w:type="dxa" w:w="60"/>
+              <w:left w:type="dxa" w:w="100"/>
+              <w:bottom w:type="dxa" w:w="60"/>
+              <w:right w:type="dxa" w:w="100"/>
+            </w:tcMar>
+          </w:tcPr>
+          <w:p>
+            <w:r>
+              <w:rPr>
+                <w:rFonts w:ascii="Calibri" w:cs="Calibri" w:eastAsia="Calibri" w:hAnsi="Calibri"/>
+                <w:sz w:val="19"/>
+                <w:szCs w:val="19"/>
+              </w:rPr>
+              <w:t xml:space="preserve">ISE (802.1X, CoA, guest), NAC</w:t>
+            </w:r>
+          </w:p>
+        </w:tc>
+        <w:tc>
+          <w:tcPr>
+            <w:tcW w:type="dxa" w:w="3346"/>
+            <w:tcBorders>
+              <w:top w:val="single" w:color="BFBFBF" w:sz="4"/>
+              <w:left w:val="single" w:color="BFBFBF" w:sz="4"/>
+              <w:bottom w:val="single" w:color="BFBFBF" w:sz="4"/>
+              <w:right w:val="single" w:color="BFBFBF" w:sz="4"/>
+            </w:tcBorders>
+            <w:tcMar>
+              <w:top w:type="dxa" w:w="60"/>
+              <w:left w:type="dxa" w:w="100"/>
+              <w:bottom w:type="dxa" w:w="60"/>
+              <w:right w:type="dxa" w:w="100"/>
+            </w:tcMar>
+          </w:tcPr>
+          <w:p>
+            <w:r>
+              <w:rPr>
+                <w:rFonts w:ascii="Calibri" w:cs="Calibri" w:eastAsia="Calibri" w:hAnsi="Calibri"/>
+                <w:b/>
+                <w:bCs/>
+                <w:sz w:val="19"/>
+                <w:szCs w:val="19"/>
+              </w:rPr>
+              <w:t xml:space="preserve">CCNP Security: SISE</w:t>
+            </w:r>
+            <w:r>
+              <w:rPr>
+                <w:rFonts w:ascii="Calibri" w:cs="Calibri" w:eastAsia="Calibri" w:hAnsi="Calibri"/>
+                <w:sz w:val="19"/>
+                <w:szCs w:val="19"/>
+              </w:rPr>
+              <w:t xml:space="preserve"> (300-715)</w:t>
+            </w:r>
+          </w:p>
+        </w:tc>
+      </w:tr>
+      <w:tr>
+        <w:tc>
+          <w:tcPr>
+            <w:tcW w:type="dxa" w:w="5680"/>
+            <w:tcBorders>
+              <w:top w:val="single" w:color="BFBFBF" w:sz="4"/>
+              <w:left w:val="single" w:color="BFBFBF" w:sz="4"/>
+              <w:bottom w:val="single" w:color="BFBFBF" w:sz="4"/>
+              <w:right w:val="single" w:color="BFBFBF" w:sz="4"/>
+            </w:tcBorders>
+            <w:tcMar>
+              <w:top w:type="dxa" w:w="60"/>
+              <w:left w:type="dxa" w:w="100"/>
+              <w:bottom w:type="dxa" w:w="60"/>
+              <w:right w:type="dxa" w:w="100"/>
+            </w:tcMar>
+          </w:tcPr>
+          <w:p>
+            <w:r>
+              <w:rPr>
+                <w:rFonts w:ascii="Calibri" w:cs="Calibri" w:eastAsia="Calibri" w:hAnsi="Calibri"/>
+                <w:sz w:val="19"/>
+                <w:szCs w:val="19"/>
+              </w:rPr>
+              <w:t xml:space="preserve">Firepower / FTD, ASA, VPN</w:t>
+            </w:r>
+          </w:p>
+        </w:tc>
+        <w:tc>
+          <w:tcPr>
+            <w:tcW w:type="dxa" w:w="3346"/>
+            <w:tcBorders>
+              <w:top w:val="single" w:color="BFBFBF" w:sz="4"/>
+              <w:left w:val="single" w:color="BFBFBF" w:sz="4"/>
+              <w:bottom w:val="single" w:color="BFBFBF" w:sz="4"/>
+              <w:right w:val="single" w:color="BFBFBF" w:sz="4"/>
+            </w:tcBorders>
+            <w:tcMar>
+              <w:top w:type="dxa" w:w="60"/>
+              <w:left w:type="dxa" w:w="100"/>
+              <w:bottom w:type="dxa" w:w="60"/>
+              <w:right w:type="dxa" w:w="100"/>
+            </w:tcMar>
+          </w:tcPr>
+          <w:p>
+            <w:r>
+              <w:rPr>
+                <w:rFonts w:ascii="Calibri" w:cs="Calibri" w:eastAsia="Calibri" w:hAnsi="Calibri"/>
+                <w:b/>
+                <w:bCs/>
+                <w:sz w:val="19"/>
+                <w:szCs w:val="19"/>
+              </w:rPr>
+              <w:t xml:space="preserve">CCNP Security: SCOR</w:t>
+            </w:r>
+            <w:r>
+              <w:rPr>
+                <w:rFonts w:ascii="Calibri" w:cs="Calibri" w:eastAsia="Calibri" w:hAnsi="Calibri"/>
+                <w:sz w:val="19"/>
+                <w:szCs w:val="19"/>
+              </w:rPr>
+              <w:t xml:space="preserve"> (350-701), </w:t>
+            </w:r>
+            <w:r>
+              <w:rPr>
+                <w:rFonts w:ascii="Calibri" w:cs="Calibri" w:eastAsia="Calibri" w:hAnsi="Calibri"/>
+                <w:b/>
+                <w:bCs/>
+                <w:sz w:val="19"/>
+                <w:szCs w:val="19"/>
+              </w:rPr>
+              <w:t xml:space="preserve">SNCF</w:t>
+            </w:r>
+            <w:r>
+              <w:rPr>
+                <w:rFonts w:ascii="Calibri" w:cs="Calibri" w:eastAsia="Calibri" w:hAnsi="Calibri"/>
+                <w:sz w:val="19"/>
+                <w:szCs w:val="19"/>
+              </w:rPr>
+              <w:t xml:space="preserve"> (300-710)</w:t>
+            </w:r>
+          </w:p>
+        </w:tc>
+      </w:tr>
+      <w:tr>
+        <w:tc>
+          <w:tcPr>
+            <w:tcW w:type="dxa" w:w="5680"/>
+            <w:tcBorders>
+              <w:top w:val="single" w:color="BFBFBF" w:sz="4"/>
+              <w:left w:val="single" w:color="BFBFBF" w:sz="4"/>
+              <w:bottom w:val="single" w:color="BFBFBF" w:sz="4"/>
+              <w:right w:val="single" w:color="BFBFBF" w:sz="4"/>
+            </w:tcBorders>
+            <w:tcMar>
+              <w:top w:type="dxa" w:w="60"/>
+              <w:left w:type="dxa" w:w="100"/>
+              <w:bottom w:type="dxa" w:w="60"/>
+              <w:right w:type="dxa" w:w="100"/>
+            </w:tcMar>
+          </w:tcPr>
+          <w:p>
+            <w:r>
+              <w:rPr>
+                <w:rFonts w:ascii="Calibri" w:cs="Calibri" w:eastAsia="Calibri" w:hAnsi="Calibri"/>
+                <w:sz w:val="19"/>
+                <w:szCs w:val="19"/>
+              </w:rPr>
+              <w:t xml:space="preserve">UCS servers, CIMC</w:t>
+            </w:r>
+          </w:p>
+        </w:tc>
+        <w:tc>
+          <w:tcPr>
+            <w:tcW w:type="dxa" w:w="3346"/>
+            <w:tcBorders>
+              <w:top w:val="single" w:color="BFBFBF" w:sz="4"/>
+              <w:left w:val="single" w:color="BFBFBF" w:sz="4"/>
+              <w:bottom w:val="single" w:color="BFBFBF" w:sz="4"/>
+              <w:right w:val="single" w:color="BFBFBF" w:sz="4"/>
+            </w:tcBorders>
+            <w:tcMar>
+              <w:top w:type="dxa" w:w="60"/>
+              <w:left w:type="dxa" w:w="100"/>
+              <w:bottom w:type="dxa" w:w="60"/>
+              <w:right w:type="dxa" w:w="100"/>
+            </w:tcMar>
+          </w:tcPr>
+          <w:p>
+            <w:r>
+              <w:rPr>
+                <w:rFonts w:ascii="Calibri" w:cs="Calibri" w:eastAsia="Calibri" w:hAnsi="Calibri"/>
+                <w:b/>
+                <w:bCs/>
+                <w:sz w:val="19"/>
+                <w:szCs w:val="19"/>
+              </w:rPr>
+              <w:t xml:space="preserve">CCNP Data Center: DCCOR</w:t>
+            </w:r>
+            <w:r>
+              <w:rPr>
+                <w:rFonts w:ascii="Calibri" w:cs="Calibri" w:eastAsia="Calibri" w:hAnsi="Calibri"/>
+                <w:sz w:val="19"/>
+                <w:szCs w:val="19"/>
+              </w:rPr>
+              <w:t xml:space="preserve"> (350-601)</w:t>
+            </w:r>
+          </w:p>
+        </w:tc>
+      </w:tr>
+      <w:tr>
+        <w:tc>
+          <w:tcPr>
+            <w:tcW w:type="dxa" w:w="5680"/>
+            <w:tcBorders>
+              <w:top w:val="single" w:color="BFBFBF" w:sz="4"/>
+              <w:left w:val="single" w:color="BFBFBF" w:sz="4"/>
+              <w:bottom w:val="single" w:color="BFBFBF" w:sz="4"/>
+              <w:right w:val="single" w:color="BFBFBF" w:sz="4"/>
+            </w:tcBorders>
+            <w:tcMar>
+              <w:top w:type="dxa" w:w="60"/>
+              <w:left w:type="dxa" w:w="100"/>
+              <w:bottom w:type="dxa" w:w="60"/>
+              <w:right w:type="dxa" w:w="100"/>
+            </w:tcMar>
+          </w:tcPr>
+          <w:p>
+            <w:r>
+              <w:rPr>
+                <w:rFonts w:ascii="Calibri" w:cs="Calibri" w:eastAsia="Calibri" w:hAnsi="Calibri"/>
+                <w:sz w:val="19"/>
+                <w:szCs w:val="19"/>
+              </w:rPr>
+              <w:t xml:space="preserve">Aruba switching (AOS-CX)</w:t>
+            </w:r>
+          </w:p>
+        </w:tc>
+        <w:tc>
+          <w:tcPr>
+            <w:tcW w:type="dxa" w:w="3346"/>
+            <w:tcBorders>
+              <w:top w:val="single" w:color="BFBFBF" w:sz="4"/>
+              <w:left w:val="single" w:color="BFBFBF" w:sz="4"/>
+              <w:bottom w:val="single" w:color="BFBFBF" w:sz="4"/>
+              <w:right w:val="single" w:color="BFBFBF" w:sz="4"/>
+            </w:tcBorders>
+            <w:tcMar>
+              <w:top w:type="dxa" w:w="60"/>
+              <w:left w:type="dxa" w:w="100"/>
+              <w:bottom w:type="dxa" w:w="60"/>
+              <w:right w:type="dxa" w:w="100"/>
+            </w:tcMar>
+          </w:tcPr>
+          <w:p>
+            <w:r>
+              <w:rPr>
+                <w:rFonts w:ascii="Calibri" w:cs="Calibri" w:eastAsia="Calibri" w:hAnsi="Calibri"/>
+                <w:b/>
+                <w:bCs/>
+                <w:sz w:val="19"/>
+                <w:szCs w:val="19"/>
+              </w:rPr>
+              <w:t xml:space="preserve">HPE Aruba Networking ACA / ACP Campus Access</w:t>
+            </w:r>
+          </w:p>
+        </w:tc>
+      </w:tr>
+      <w:tr>
+        <w:tc>
+          <w:tcPr>
+            <w:tcW w:type="dxa" w:w="5680"/>
+            <w:tcBorders>
+              <w:top w:val="single" w:color="BFBFBF" w:sz="4"/>
+              <w:left w:val="single" w:color="BFBFBF" w:sz="4"/>
+              <w:bottom w:val="single" w:color="BFBFBF" w:sz="4"/>
+              <w:right w:val="single" w:color="BFBFBF" w:sz="4"/>
+            </w:tcBorders>
+            <w:tcMar>
+              <w:top w:type="dxa" w:w="60"/>
+              <w:left w:type="dxa" w:w="100"/>
+              <w:bottom w:type="dxa" w:w="60"/>
+              <w:right w:type="dxa" w:w="100"/>
+            </w:tcMar>
+          </w:tcPr>
+          <w:p>
+            <w:r>
+              <w:rPr>
+                <w:rFonts w:ascii="Calibri" w:cs="Calibri" w:eastAsia="Calibri" w:hAnsi="Calibri"/>
+                <w:sz w:val="19"/>
+                <w:szCs w:val="19"/>
+              </w:rPr>
+              <w:t xml:space="preserve">Aruba wireless (Instant, controllers, Central)</w:t>
+            </w:r>
+          </w:p>
+        </w:tc>
+        <w:tc>
+          <w:tcPr>
+            <w:tcW w:type="dxa" w:w="3346"/>
+            <w:tcBorders>
+              <w:top w:val="single" w:color="BFBFBF" w:sz="4"/>
+              <w:left w:val="single" w:color="BFBFBF" w:sz="4"/>
+              <w:bottom w:val="single" w:color="BFBFBF" w:sz="4"/>
+              <w:right w:val="single" w:color="BFBFBF" w:sz="4"/>
+            </w:tcBorders>
+            <w:tcMar>
+              <w:top w:type="dxa" w:w="60"/>
+              <w:left w:type="dxa" w:w="100"/>
+              <w:bottom w:type="dxa" w:w="60"/>
+              <w:right w:type="dxa" w:w="100"/>
+            </w:tcMar>
+          </w:tcPr>
+          <w:p>
+            <w:r>
+              <w:rPr>
+                <w:rFonts w:ascii="Calibri" w:cs="Calibri" w:eastAsia="Calibri" w:hAnsi="Calibri"/>
+                <w:b/>
+                <w:bCs/>
+                <w:sz w:val="19"/>
+                <w:szCs w:val="19"/>
+              </w:rPr>
+              <w:t xml:space="preserve">HPE Aruba Networking ACA / ACP Mobility</w:t>
+            </w:r>
+          </w:p>
+        </w:tc>
+      </w:tr>
+      <w:tr>
+        <w:tc>
+          <w:tcPr>
+            <w:tcW w:type="dxa" w:w="5680"/>
+            <w:tcBorders>
+              <w:top w:val="single" w:color="BFBFBF" w:sz="4"/>
+              <w:left w:val="single" w:color="BFBFBF" w:sz="4"/>
+              <w:bottom w:val="single" w:color="BFBFBF" w:sz="4"/>
+              <w:right w:val="single" w:color="BFBFBF" w:sz="4"/>
+            </w:tcBorders>
+            <w:tcMar>
+              <w:top w:type="dxa" w:w="60"/>
+              <w:left w:type="dxa" w:w="100"/>
+              <w:bottom w:type="dxa" w:w="60"/>
+              <w:right w:type="dxa" w:w="100"/>
+            </w:tcMar>
+          </w:tcPr>
+          <w:p>
+            <w:r>
+              <w:rPr>
+                <w:rFonts w:ascii="Calibri" w:cs="Calibri" w:eastAsia="Calibri" w:hAnsi="Calibri"/>
+                <w:sz w:val="19"/>
+                <w:szCs w:val="19"/>
+              </w:rPr>
+              <w:t xml:space="preserve">ClearPass</w:t>
+            </w:r>
+          </w:p>
+        </w:tc>
+        <w:tc>
+          <w:tcPr>
+            <w:tcW w:type="dxa" w:w="3346"/>
+            <w:tcBorders>
+              <w:top w:val="single" w:color="BFBFBF" w:sz="4"/>
+              <w:left w:val="single" w:color="BFBFBF" w:sz="4"/>
+              <w:bottom w:val="single" w:color="BFBFBF" w:sz="4"/>
+              <w:right w:val="single" w:color="BFBFBF" w:sz="4"/>
+            </w:tcBorders>
+            <w:tcMar>
+              <w:top w:type="dxa" w:w="60"/>
+              <w:left w:type="dxa" w:w="100"/>
+              <w:bottom w:type="dxa" w:w="60"/>
+              <w:right w:type="dxa" w:w="100"/>
+            </w:tcMar>
+          </w:tcPr>
+          <w:p>
+            <w:r>
+              <w:rPr>
+                <w:rFonts w:ascii="Calibri" w:cs="Calibri" w:eastAsia="Calibri" w:hAnsi="Calibri"/>
+                <w:b/>
+                <w:bCs/>
+                <w:sz w:val="19"/>
+                <w:szCs w:val="19"/>
+              </w:rPr>
+              <w:t xml:space="preserve">HPE Aruba Networking ACP Network Security</w:t>
+            </w:r>
+          </w:p>
+        </w:tc>
+      </w:tr>
+    </w:tbl>
+    <w:p/>
+    <w:p>
+      <w:r>
+        <w:rPr>
+          <w:rFonts w:ascii="Calibri" w:cs="Calibri" w:eastAsia="Calibri" w:hAnsi="Calibri"/>
+          <w:b/>
+          <w:bCs/>
+        </w:rPr>
+        <w:t xml:space="preserve">Planned order</w:t>
+      </w:r>
+    </w:p>
+    <w:p>
+      <w:r>
+        <w:rPr>
+          <w:rFonts w:ascii="Calibri" w:cs="Calibri" w:eastAsia="Calibri" w:hAnsi="Calibri"/>
+        </w:rPr>
+        <w:t xml:space="preserve">1. Finish the CCNA.</w:t>
+      </w:r>
+    </w:p>
+    <w:p>
+      <w:r>
+        <w:rPr>
+          <w:rFonts w:ascii="Calibri" w:cs="Calibri" w:eastAsia="Calibri" w:hAnsi="Calibri"/>
+        </w:rPr>
+        <w:t xml:space="preserve">2. CCNP Enterprise: ENCOR first (widest match to the SOPs), then one concentration — ENARSI (routing/switching) or ENWLSI (school wireless).</w:t>
+      </w:r>
+    </w:p>
+    <w:p>
+      <w:r>
+        <w:rPr>
+          <w:rFonts w:ascii="Calibri" w:cs="Calibri" w:eastAsia="Calibri" w:hAnsi="Calibri"/>
+        </w:rPr>
+        <w:t xml:space="preserve">3. Aruba ACA / ACP Mobility — the sites run Aruba wireless.</w:t>
+      </w:r>
+    </w:p>
+    <w:p>
+      <w:r>
+        <w:rPr>
+          <w:rFonts w:ascii="Calibri" w:cs="Calibri" w:eastAsia="Calibri" w:hAnsi="Calibri"/>
+        </w:rPr>
+        <w:t xml:space="preserve">4. Later: SISE if working on ISE / NAC.</w:t>
+      </w:r>
+    </w:p>
+    <w:p>
+      <w:r>
+        <w:rPr>
+          <w:rFonts w:ascii="Calibri" w:cs="Calibri" w:eastAsia="Calibri" w:hAnsi="Calibri"/>
+          <w:b/>
+          <w:bCs/>
+        </w:rPr>
+        <w:t xml:space="preserve">Where to study</w:t>
+      </w:r>
+    </w:p>
+    <w:p>
+      <w:pPr>
+        <w:pStyle w:val="ListParagraph"/>
+        <w:numPr>
+          <w:ilvl w:val="0"/>
+          <w:numId w:val="2"/>
+        </w:numPr>
+      </w:pPr>
+      <w:r>
+        <w:rPr>
+          <w:rFonts w:ascii="Calibri" w:cs="Calibri" w:eastAsia="Calibri" w:hAnsi="Calibri"/>
+          <w:b/>
+          <w:bCs/>
+        </w:rPr>
+        <w:t xml:space="preserve">Cisco Networking Academy (NetAcad):</w:t>
+      </w:r>
+      <w:r>
+        <w:rPr>
+          <w:rFonts w:ascii="Calibri" w:cs="Calibri" w:eastAsia="Calibri" w:hAnsi="Calibri"/>
+        </w:rPr>
+        <w:t xml:space="preserve"> CCNA courses, free or low cost through partner institutions (TAFEs often run them).</w:t>
+      </w:r>
+    </w:p>
+    <w:p>
+      <w:pPr>
+        <w:pStyle w:val="ListParagraph"/>
+        <w:numPr>
+          <w:ilvl w:val="0"/>
+          <w:numId w:val="2"/>
+        </w:numPr>
+      </w:pPr>
+      <w:r>
+        <w:rPr>
+          <w:rFonts w:ascii="Calibri" w:cs="Calibri" w:eastAsia="Calibri" w:hAnsi="Calibri"/>
+          <w:b/>
+          <w:bCs/>
+        </w:rPr>
+        <w:t xml:space="preserve">Cisco U.:</w:t>
+      </w:r>
+      <w:r>
+        <w:rPr>
+          <w:rFonts w:ascii="Calibri" w:cs="Calibri" w:eastAsia="Calibri" w:hAnsi="Calibri"/>
+        </w:rPr>
+        <w:t xml:space="preserve"> Cisco's paid platform with official CCNA and CCNP courses and labs.</w:t>
+      </w:r>
+    </w:p>
+    <w:p>
+      <w:pPr>
+        <w:pStyle w:val="ListParagraph"/>
+        <w:numPr>
+          <w:ilvl w:val="0"/>
+          <w:numId w:val="2"/>
+        </w:numPr>
+      </w:pPr>
+      <w:r>
+        <w:rPr>
+          <w:rFonts w:ascii="Calibri" w:cs="Calibri" w:eastAsia="Calibri" w:hAnsi="Calibri"/>
+          <w:b/>
+          <w:bCs/>
+        </w:rPr>
+        <w:t xml:space="preserve">HPE Aruba Networking Learning Center:</w:t>
+      </w:r>
+      <w:r>
+        <w:rPr>
+          <w:rFonts w:ascii="Calibri" w:cs="Calibri" w:eastAsia="Calibri" w:hAnsi="Calibri"/>
+        </w:rPr>
+        <w:t xml:space="preserve"> Aruba courses and exams.</w:t>
+      </w:r>
+    </w:p>
+    <w:p>
+      <w:pPr>
+        <w:pStyle w:val="ListParagraph"/>
+        <w:numPr>
+          <w:ilvl w:val="0"/>
+          <w:numId w:val="2"/>
+        </w:numPr>
+      </w:pPr>
+      <w:r>
+        <w:rPr>
+          <w:rFonts w:ascii="Calibri" w:cs="Calibri" w:eastAsia="Calibri" w:hAnsi="Calibri"/>
+          <w:b/>
+          <w:bCs/>
+        </w:rPr>
+        <w:t xml:space="preserve">Labs:</w:t>
+      </w:r>
+      <w:r>
+        <w:rPr>
+          <w:rFonts w:ascii="Calibri" w:cs="Calibri" w:eastAsia="Calibri" w:hAnsi="Calibri"/>
+        </w:rPr>
+        <w:t xml:space="preserve"> Packet Tracer (CCNA), Cisco Modeling Labs, GNS3 / EVE-NG with the Aruba AOS-CX Simulator, Cisco DevNet Sandboxes (9800 WLC, ISE, Catalyst Center, SD-WAN).</w:t>
+      </w:r>
+    </w:p>
+    <w:p>
+      <w:r>
+        <w:rPr>
+          <w:rFonts w:ascii="Calibri" w:cs="Calibri" w:eastAsia="Calibri" w:hAnsi="Calibri"/>
+          <w:b/>
+          <w:bCs/>
+        </w:rPr>
+        <w:t xml:space="preserve">Takeaway / next action</w:t>
+      </w:r>
+    </w:p>
+    <w:p>
+      <w:r>
+        <w:rPr>
+          <w:rFonts w:ascii="Calibri" w:cs="Calibri" w:eastAsia="Calibri" w:hAnsi="Calibri"/>
+        </w:rPr>
+        <w:t xml:space="preserve">Exam codes and versions change every few years (Cisco has been restructuring the wireless exams), so check cisco.com and the HPE Aruba Networking site before booking. Tag each new real-world entry with the course that covers it, so the notes double as a study map.</w:t>
       </w:r>
     </w:p>
     <w:p>
@@ -6395,7 +7485,7 @@
           <w:numId w:val="2"/>
         </w:numPr>
       </w:pPr>
-      <w:hyperlink w:history="1" r:id="rIdfpldnuncob0y1cyldpc_n">
+      <w:hyperlink w:history="1" r:id="rIdzjl0ldodh4wk134ogyc0u">
         <w:r>
           <w:rPr>
             <w:rStyle w:val="Hyperlink"/>
@@ -6413,7 +7503,7 @@
           <w:numId w:val="2"/>
         </w:numPr>
       </w:pPr>
-      <w:hyperlink w:history="1" r:id="rIdp4fs5jz8ifgsyn2umc8mb">
+      <w:hyperlink w:history="1" r:id="rIdxkecj6ztkqgx8yvagskna">
         <w:r>
           <w:rPr>
             <w:rStyle w:val="Hyperlink"/>
@@ -6431,7 +7521,7 @@
           <w:numId w:val="2"/>
         </w:numPr>
       </w:pPr>
-      <w:hyperlink w:history="1" r:id="rIdyvryfy-8thce1r-yxt2-d">
+      <w:hyperlink w:history="1" r:id="rIdb04h1uowhcw7f5ov8fdaj">
         <w:r>
           <w:rPr>
             <w:rStyle w:val="Hyperlink"/>

</xml_diff>

<commit_message>
Tag each CCNA vs Real World entry with the course that covers it
Co-Authored-By: Claude Opus 5.5 <noreply@anthropic.com>
Claude-Session: https://claude.ai/code/session_01DZwzvGP29kTgZHNh8Sqgpd
</commit_message>
<xml_diff>
--- a/real-world/CCNA_vs_RealWorld.docx
+++ b/real-world/CCNA_vs_RealWorld.docx
@@ -1190,7 +1190,21 @@
         <w:rPr>
           <w:rFonts w:ascii="Calibri" w:cs="Calibri" w:eastAsia="Calibri" w:hAnsi="Calibri"/>
         </w:rPr>
-        <w:t xml:space="preserve">Exam codes and versions change every few years (Cisco has been restructuring the wireless exams), so check cisco.com and the HPE Aruba Networking site before booking. Tag each new real-world entry with the course that covers it, so the notes double as a study map.</w:t>
+        <w:t xml:space="preserve">Exam codes and versions change every few years (Cisco has been restructuring the wireless exams), so check cisco.com and the HPE Aruba Networking site before booking. Each entry carries a </w:t>
+      </w:r>
+      <w:r>
+        <w:rPr>
+          <w:rFonts w:ascii="Calibri" w:cs="Calibri" w:eastAsia="Calibri" w:hAnsi="Calibri"/>
+          <w:b/>
+          <w:bCs/>
+        </w:rPr>
+        <w:t xml:space="preserve">📚 Study</w:t>
+      </w:r>
+      <w:r>
+        <w:rPr>
+          <w:rFonts w:ascii="Calibri" w:cs="Calibri" w:eastAsia="Calibri" w:hAnsi="Calibri"/>
+        </w:rPr>
+        <w:t xml:space="preserve"> line naming the course that covers it, so the notes double as a study map.</w:t>
       </w:r>
     </w:p>
     <w:p>
@@ -1218,6 +1232,22 @@
           <w:rFonts w:ascii="Calibri" w:cs="Calibri" w:eastAsia="Calibri" w:hAnsi="Calibri"/>
         </w:rPr>
         <w:t xml:space="preserve"> CCNP — Storm Control isn't on the CCNA; the STP side is CCNA (2.5).</w:t>
+      </w:r>
+    </w:p>
+    <w:p>
+      <w:r>
+        <w:rPr>
+          <w:rFonts w:ascii="Calibri" w:cs="Calibri" w:eastAsia="Calibri" w:hAnsi="Calibri"/>
+          <w:b/>
+          <w:bCs/>
+        </w:rPr>
+        <w:t xml:space="preserve">📚 Study:</w:t>
+      </w:r>
+      <w:r>
+        <w:rPr>
+          <w:rFonts w:ascii="Calibri" w:cs="Calibri" w:eastAsia="Calibri" w:hAnsi="Calibri"/>
+        </w:rPr>
+        <w:t xml:space="preserve"> ENCOR (350-401) — switching hardening and STP</w:t>
       </w:r>
     </w:p>
     <w:p>
@@ -1319,6 +1349,22 @@
           <w:rFonts w:ascii="Calibri" w:cs="Calibri" w:eastAsia="Calibri" w:hAnsi="Calibri"/>
         </w:rPr>
         <w:t xml:space="preserve"> CCNA + Vendor — 802.1Q tagging and native VLAN are CCNA (2.1, 2.2); the hybrid port type is vendor-specific and not in any Cisco exam.</w:t>
+      </w:r>
+    </w:p>
+    <w:p>
+      <w:r>
+        <w:rPr>
+          <w:rFonts w:ascii="Calibri" w:cs="Calibri" w:eastAsia="Calibri" w:hAnsi="Calibri"/>
+          <w:b/>
+          <w:bCs/>
+        </w:rPr>
+        <w:t xml:space="preserve">📚 Study:</w:t>
+      </w:r>
+      <w:r>
+        <w:rPr>
+          <w:rFonts w:ascii="Calibri" w:cs="Calibri" w:eastAsia="Calibri" w:hAnsi="Calibri"/>
+        </w:rPr>
+        <w:t xml:space="preserve"> CCNA (2.1, 2.2) for 802.1Q; Comware/VRP CLI is vendor docs only (closest: HPE Aruba ACA Campus Access for non-Cisco switching)</w:t>
       </w:r>
     </w:p>
     <w:p>
@@ -2398,6 +2444,22 @@
           <w:rFonts w:ascii="Calibri" w:cs="Calibri" w:eastAsia="Calibri" w:hAnsi="Calibri"/>
           <w:b/>
           <w:bCs/>
+        </w:rPr>
+        <w:t xml:space="preserve">📚 Study:</w:t>
+      </w:r>
+      <w:r>
+        <w:rPr>
+          <w:rFonts w:ascii="Calibri" w:cs="Calibri" w:eastAsia="Calibri" w:hAnsi="Calibri"/>
+        </w:rPr>
+        <w:t xml:space="preserve"> ENCOR (350-401) — Layer 2 troubleshooting</w:t>
+      </w:r>
+    </w:p>
+    <w:p>
+      <w:r>
+        <w:rPr>
+          <w:rFonts w:ascii="Calibri" w:cs="Calibri" w:eastAsia="Calibri" w:hAnsi="Calibri"/>
+          <w:b/>
+          <w:bCs/>
           <w:i/>
           <w:iCs/>
         </w:rPr>
@@ -2560,6 +2622,22 @@
           <w:rFonts w:ascii="Calibri" w:cs="Calibri" w:eastAsia="Calibri" w:hAnsi="Calibri"/>
         </w:rPr>
         <w:t xml:space="preserve"> CCNA + CCNP — static routes, AD and floating statics are CCNA (3.3); Null0, RTBH and BGP aggregates are CCNP (ENARSI).</w:t>
+      </w:r>
+    </w:p>
+    <w:p>
+      <w:r>
+        <w:rPr>
+          <w:rFonts w:ascii="Calibri" w:cs="Calibri" w:eastAsia="Calibri" w:hAnsi="Calibri"/>
+          <w:b/>
+          <w:bCs/>
+        </w:rPr>
+        <w:t xml:space="preserve">📚 Study:</w:t>
+      </w:r>
+      <w:r>
+        <w:rPr>
+          <w:rFonts w:ascii="Calibri" w:cs="Calibri" w:eastAsia="Calibri" w:hAnsi="Calibri"/>
+        </w:rPr>
+        <w:t xml:space="preserve"> ENARSI (300-410) — route summarisation, BGP</w:t>
       </w:r>
     </w:p>
     <w:p>
@@ -3018,6 +3096,22 @@
           <w:b/>
           <w:bCs/>
         </w:rPr>
+        <w:t xml:space="preserve">📚 Study:</w:t>
+      </w:r>
+      <w:r>
+        <w:rPr>
+          <w:rFonts w:ascii="Calibri" w:cs="Calibri" w:eastAsia="Calibri" w:hAnsi="Calibri"/>
+        </w:rPr>
+        <w:t xml:space="preserve"> CCNA (1.12) concept; ENARSI (300-410) — VRF-lite</w:t>
+      </w:r>
+    </w:p>
+    <w:p>
+      <w:r>
+        <w:rPr>
+          <w:rFonts w:ascii="Calibri" w:cs="Calibri" w:eastAsia="Calibri" w:hAnsi="Calibri"/>
+          <w:b/>
+          <w:bCs/>
+        </w:rPr>
         <w:t xml:space="preserve">⚙ Work reference —</w:t>
       </w:r>
       <w:r>
@@ -3243,6 +3337,22 @@
           <w:rFonts w:ascii="Calibri" w:cs="Calibri" w:eastAsia="Calibri" w:hAnsi="Calibri"/>
         </w:rPr>
         <w:t xml:space="preserve"> CCNA + On-the-job — what SNMP does is CCNA (4.4); individual OIDs and Cisco MIBs are job knowledge, not exam content.</w:t>
+      </w:r>
+    </w:p>
+    <w:p>
+      <w:r>
+        <w:rPr>
+          <w:rFonts w:ascii="Calibri" w:cs="Calibri" w:eastAsia="Calibri" w:hAnsi="Calibri"/>
+          <w:b/>
+          <w:bCs/>
+        </w:rPr>
+        <w:t xml:space="preserve">📚 Study:</w:t>
+      </w:r>
+      <w:r>
+        <w:rPr>
+          <w:rFonts w:ascii="Calibri" w:cs="Calibri" w:eastAsia="Calibri" w:hAnsi="Calibri"/>
+        </w:rPr>
+        <w:t xml:space="preserve"> CCNA (4.4); ENCOR (350-401) — network assurance and monitoring</w:t>
       </w:r>
     </w:p>
     <w:p>
@@ -7485,7 +7595,7 @@
           <w:numId w:val="2"/>
         </w:numPr>
       </w:pPr>
-      <w:hyperlink w:history="1" r:id="rIdzjl0ldodh4wk134ogyc0u">
+      <w:hyperlink w:history="1" r:id="rIdyb4xuv_w5jnil4mngknvu">
         <w:r>
           <w:rPr>
             <w:rStyle w:val="Hyperlink"/>
@@ -7503,7 +7613,7 @@
           <w:numId w:val="2"/>
         </w:numPr>
       </w:pPr>
-      <w:hyperlink w:history="1" r:id="rIdxkecj6ztkqgx8yvagskna">
+      <w:hyperlink w:history="1" r:id="rId3hicswgygrgns22wirkav">
         <w:r>
           <w:rPr>
             <w:rStyle w:val="Hyperlink"/>
@@ -7521,7 +7631,7 @@
           <w:numId w:val="2"/>
         </w:numPr>
       </w:pPr>
-      <w:hyperlink w:history="1" r:id="rIdb04h1uowhcw7f5ov8fdaj">
+      <w:hyperlink w:history="1" r:id="rIdiw-41r4bro6q_mmf6vebq">
         <w:r>
           <w:rPr>
             <w:rStyle w:val="Hyperlink"/>
@@ -7578,6 +7688,22 @@
           <w:rFonts w:ascii="Calibri" w:cs="Calibri" w:eastAsia="Calibri" w:hAnsi="Calibri"/>
           <w:b/>
           <w:bCs/>
+        </w:rPr>
+        <w:t xml:space="preserve">📚 Study:</w:t>
+      </w:r>
+      <w:r>
+        <w:rPr>
+          <w:rFonts w:ascii="Calibri" w:cs="Calibri" w:eastAsia="Calibri" w:hAnsi="Calibri"/>
+        </w:rPr>
+        <w:t xml:space="preserve"> No specific course (on-the-job); closest: ENCOR (350-401) — network services</w:t>
+      </w:r>
+    </w:p>
+    <w:p>
+      <w:r>
+        <w:rPr>
+          <w:rFonts w:ascii="Calibri" w:cs="Calibri" w:eastAsia="Calibri" w:hAnsi="Calibri"/>
+          <w:b/>
+          <w:bCs/>
           <w:i/>
           <w:iCs/>
         </w:rPr>
@@ -7747,6 +7873,22 @@
           <w:rFonts w:ascii="Calibri" w:cs="Calibri" w:eastAsia="Calibri" w:hAnsi="Calibri"/>
           <w:b/>
           <w:bCs/>
+        </w:rPr>
+        <w:t xml:space="preserve">📚 Study:</w:t>
+      </w:r>
+      <w:r>
+        <w:rPr>
+          <w:rFonts w:ascii="Calibri" w:cs="Calibri" w:eastAsia="Calibri" w:hAnsi="Calibri"/>
+        </w:rPr>
+        <w:t xml:space="preserve"> CCNA (3.x); ENARSI (300-410) — routing troubleshooting</w:t>
+      </w:r>
+    </w:p>
+    <w:p>
+      <w:r>
+        <w:rPr>
+          <w:rFonts w:ascii="Calibri" w:cs="Calibri" w:eastAsia="Calibri" w:hAnsi="Calibri"/>
+          <w:b/>
+          <w:bCs/>
           <w:i/>
           <w:iCs/>
         </w:rPr>
@@ -7914,6 +8056,22 @@
           <w:rFonts w:ascii="Calibri" w:cs="Calibri" w:eastAsia="Calibri" w:hAnsi="Calibri"/>
         </w:rPr>
         <w:t xml:space="preserve"> CCNA + Vendor — VLANs, trunks and allowed-VLAN lists are CCNA (2.1, 2.2); 802.1X/RADIUS is CCNA (5.x); dynamic VLAN assignment and Aruba Instant virtual controller forwarding are vendor-specific.</w:t>
+      </w:r>
+    </w:p>
+    <w:p>
+      <w:r>
+        <w:rPr>
+          <w:rFonts w:ascii="Calibri" w:cs="Calibri" w:eastAsia="Calibri" w:hAnsi="Calibri"/>
+          <w:b/>
+          <w:bCs/>
+        </w:rPr>
+        <w:t xml:space="preserve">📚 Study:</w:t>
+      </w:r>
+      <w:r>
+        <w:rPr>
+          <w:rFonts w:ascii="Calibri" w:cs="Calibri" w:eastAsia="Calibri" w:hAnsi="Calibri"/>
+        </w:rPr>
+        <w:t xml:space="preserve"> ENWLSI (300-430); SISE (300-715) for RADIUS/CoA; HPE Aruba ACA/ACP Mobility for Instant</w:t>
       </w:r>
     </w:p>
     <w:p>

</xml_diff>